<commit_message>
Adiciona os nomes dos estudantes e o link do repositório na entrega
</commit_message>
<xml_diff>
--- a/T1_Entrega_Rede_de_Filas.docx
+++ b/T1_Entrega_Rede_de_Filas.docx
@@ -1,6 +1,6 @@
 
 <file path=word/document.xml><?xml version="1.0" encoding="utf-8"?>
-<w:document xmlns:wpc="http://schemas.microsoft.com/office/word/2010/wordprocessingCanvas" xmlns:cx="http://schemas.microsoft.com/office/drawing/2014/chartex" xmlns:cx1="http://schemas.microsoft.com/office/drawing/2015/9/8/chartex" xmlns:cx2="http://schemas.microsoft.com/office/drawing/2015/10/21/chartex" xmlns:cx3="http://schemas.microsoft.com/office/drawing/2016/5/9/chartex" xmlns:cx4="http://schemas.microsoft.com/office/drawing/2016/5/10/chartex" xmlns:cx5="http://schemas.microsoft.com/office/drawing/2016/5/11/chartex" xmlns:cx6="http://schemas.microsoft.com/office/drawing/2016/5/12/chartex" xmlns:cx7="http://schemas.microsoft.com/office/drawing/2016/5/13/chartex" xmlns:cx8="http://schemas.microsoft.com/office/drawing/2016/5/14/chartex" xmlns:mc="http://schemas.openxmlformats.org/markup-compatibility/2006" xmlns:aink="http://schemas.microsoft.com/office/drawing/2016/ink" xmlns:am3d="http://schemas.microsoft.com/office/drawing/2017/model3d" xmlns:o="urn:schemas-microsoft-com:office:office" xmlns:oel="http://schemas.microsoft.com/office/2019/extlst" xmlns:r="http://schemas.openxmlformats.org/officeDocument/2006/relationships" xmlns:m="http://schemas.openxmlformats.org/officeDocument/2006/math" xmlns:v="urn:schemas-microsoft-com:vml" xmlns:wp14="http://schemas.microsoft.com/office/word/2010/wordprocessingDrawing" xmlns:wp="http://schemas.openxmlformats.org/drawingml/2006/wordprocessingDrawing" xmlns:w10="urn:schemas-microsoft-com:office:word" xmlns:w="http://schemas.openxmlformats.org/wordprocessingml/2006/main" xmlns:w14="http://schemas.microsoft.com/office/word/2010/wordml" xmlns:w15="http://schemas.microsoft.com/office/word/2012/wordml" xmlns:w16cex="http://schemas.microsoft.com/office/word/2018/wordml/cex" xmlns:w16cid="http://schemas.microsoft.com/office/word/2016/wordml/cid" xmlns:w16="http://schemas.microsoft.com/office/word/2018/wordml" xmlns:w16du="http://schemas.microsoft.com/office/word/2023/wordml/word16du" xmlns:w16sdtdh="http://schemas.microsoft.com/office/word/2020/wordml/sdtdatahash" xmlns:w16sdtfl="http://schemas.microsoft.com/office/word/2024/wordml/sdtformatlock" xmlns:w16se="http://schemas.microsoft.com/office/word/2015/wordml/symex" xmlns:wpg="http://schemas.microsoft.com/office/word/2010/wordprocessingGroup" xmlns:wpi="http://schemas.microsoft.com/office/word/2010/wordprocessingInk" xmlns:wne="http://schemas.microsoft.com/office/word/2006/wordml" xmlns:wps="http://schemas.microsoft.com/office/word/2010/wordprocessingShape" mc:Ignorable="w14 w15 w16se w16cid w16 w16cex w16sdtdh w16sdtfl w16du wp14">
+<w:document xmlns:wpc="http://schemas.microsoft.com/office/word/2010/wordprocessingCanvas" xmlns:cx="http://schemas.microsoft.com/office/drawing/2014/chartex" xmlns:cx1="http://schemas.microsoft.com/office/drawing/2015/9/8/chartex" xmlns:cx2="http://schemas.microsoft.com/office/drawing/2015/10/21/chartex" xmlns:cx3="http://schemas.microsoft.com/office/drawing/2016/5/9/chartex" xmlns:cx4="http://schemas.microsoft.com/office/drawing/2016/5/10/chartex" xmlns:cx5="http://schemas.microsoft.com/office/drawing/2016/5/11/chartex" xmlns:cx6="http://schemas.microsoft.com/office/drawing/2016/5/12/chartex" xmlns:cx7="http://schemas.microsoft.com/office/drawing/2016/5/13/chartex" xmlns:cx8="http://schemas.microsoft.com/office/drawing/2016/5/14/chartex" xmlns:mc="http://schemas.openxmlformats.org/markup-compatibility/2006" xmlns:aink="http://schemas.microsoft.com/office/drawing/2016/ink" xmlns:am3d="http://schemas.microsoft.com/office/drawing/2017/model3d" xmlns:o="urn:schemas-microsoft-com:office:office" xmlns:oel="http://schemas.microsoft.com/office/2019/extlst" xmlns:r="http://schemas.openxmlformats.org/officeDocument/2006/relationships" xmlns:m="http://schemas.openxmlformats.org/officeDocument/2006/math" xmlns:v="urn:schemas-microsoft-com:vml" xmlns:wp14="http://schemas.microsoft.com/office/word/2010/wordprocessingDrawing" xmlns:wp="http://schemas.openxmlformats.org/drawingml/2006/wordprocessingDrawing" xmlns:w10="urn:schemas-microsoft-com:office:word" xmlns:w="http://schemas.openxmlformats.org/wordprocessingml/2006/main" xmlns:w14="http://schemas.microsoft.com/office/word/2010/wordml" xmlns:w15="http://schemas.microsoft.com/office/word/2012/wordml" xmlns:w16cex="http://schemas.microsoft.com/office/word/2018/wordml/cex" xmlns:w16cid="http://schemas.microsoft.com/office/word/2016/wordml/cid" xmlns:w16="http://schemas.microsoft.com/office/word/2018/wordml" xmlns:w16du="http://schemas.microsoft.com/office/word/2023/wordml/word16du" xmlns:w16sdtdh="http://schemas.microsoft.com/office/word/2020/wordml/sdtdatahash" xmlns:w16se="http://schemas.microsoft.com/office/word/2015/wordml/symex" xmlns:wpg="http://schemas.microsoft.com/office/word/2010/wordprocessingGroup" xmlns:wpi="http://schemas.microsoft.com/office/word/2010/wordprocessingInk" xmlns:wne="http://schemas.microsoft.com/office/word/2006/wordml" xmlns:wps="http://schemas.microsoft.com/office/word/2010/wordprocessingShape" mc:Ignorable="w14 w15 w16se w16cid w16 w16cex w16sdtdh w16du wp14">
   <w:body>
     <w:p>
       <w:pPr>
@@ -86,6 +86,7 @@
         <w:jc w:val="both"/>
         <w:rPr>
           <w:b/>
+          <w:lang w:val="en-BR"/>
         </w:rPr>
       </w:pPr>
       <w:r>
@@ -94,6 +95,78 @@
         </w:rPr>
         <w:t xml:space="preserve">Estudantes: </w:t>
       </w:r>
+      <w:r>
+        <w:rPr>
+          <w:bCs/>
+        </w:rPr>
+        <w:t xml:space="preserve">Christian Kossmann, </w:t>
+      </w:r>
+      <w:r>
+        <w:rPr>
+          <w:bCs/>
+          <w:lang w:val="en-BR"/>
+        </w:rPr>
+        <w:t>A</w:t>
+      </w:r>
+      <w:r>
+        <w:rPr>
+          <w:bCs/>
+          <w:lang w:val="en-BR"/>
+        </w:rPr>
+        <w:t>nderson</w:t>
+      </w:r>
+      <w:r>
+        <w:rPr>
+          <w:bCs/>
+          <w:lang w:val="en-BR"/>
+        </w:rPr>
+        <w:t xml:space="preserve"> S</w:t>
+      </w:r>
+      <w:r>
+        <w:rPr>
+          <w:bCs/>
+          <w:lang w:val="en-BR"/>
+        </w:rPr>
+        <w:t>prenger</w:t>
+      </w:r>
+      <w:r>
+        <w:rPr>
+          <w:bCs/>
+          <w:lang w:val="en-BR"/>
+        </w:rPr>
+        <w:t xml:space="preserve"> &amp; </w:t>
+      </w:r>
+      <w:r>
+        <w:rPr>
+          <w:bCs/>
+        </w:rPr>
+        <w:t xml:space="preserve">Gabriel </w:t>
+      </w:r>
+      <w:proofErr w:type="spellStart"/>
+      <w:r>
+        <w:rPr>
+          <w:bCs/>
+        </w:rPr>
+        <w:t>Dalbem</w:t>
+      </w:r>
+      <w:proofErr w:type="spellEnd"/>
+    </w:p>
+    <w:p>
+      <w:pPr>
+        <w:jc w:val="both"/>
+        <w:rPr>
+          <w:b/>
+          <w:lang w:val="en-BR"/>
+        </w:rPr>
+      </w:pPr>
+    </w:p>
+    <w:p>
+      <w:pPr>
+        <w:jc w:val="both"/>
+        <w:rPr>
+          <w:b/>
+        </w:rPr>
+      </w:pPr>
     </w:p>
     <w:p>
       <w:pPr>
@@ -117,7 +190,7 @@
           <w:noProof/>
         </w:rPr>
         <w:drawing>
-          <wp:inline distT="0" distB="0" distL="0" distR="0" wp14:anchorId="4BC513AC" wp14:editId="5768571D">
+          <wp:inline distT="0" distB="0" distL="0" distR="0" wp14:anchorId="0E8B8E84" wp14:editId="2782E452">
             <wp:extent cx="6115050" cy="1057275"/>
             <wp:effectExtent l="0" t="0" r="0" b="9525"/>
             <wp:docPr id="884238095" name="Imagem 1"/>
@@ -188,7 +261,7 @@
           <w:b/>
           <w:bCs/>
         </w:rPr>
-        <w:t xml:space="preserve">Entrega | Simulador para Rede de Filas</w:t>
+        <w:t>Entrega | Simulador para Rede de Filas</w:t>
       </w:r>
     </w:p>
     <w:p>
@@ -262,17 +335,25 @@
           </w:tcPr>
           <w:p>
             <w:r>
-              <w:t xml:space="preserve">&lt;link do repositório&gt;</w:t>
+              <w:t>https://github.com/Gabi2175/simulacao-e-metodos-analiticos</w:t>
             </w:r>
           </w:p>
           <w:p>
             <w:r>
-              <w:t xml:space="preserve">Modelo simulado: model.yml. Executar com: python3 simulador.py model.yml</w:t>
+              <w:t xml:space="preserve">Modelo simulado: </w:t>
+            </w:r>
+            <w:proofErr w:type="spellStart"/>
+            <w:r>
+              <w:t>model.yml</w:t>
+            </w:r>
+            <w:proofErr w:type="spellEnd"/>
+            <w:r>
+              <w:t>. Executar com: python3 simulador.py model.yml</w:t>
             </w:r>
           </w:p>
           <w:p>
             <w:r>
-              <w:t xml:space="preserve">Instruções de uso no README.md do repositório.</w:t>
+              <w:t>Instruções de uso no README.md do repositório.</w:t>
             </w:r>
           </w:p>
         </w:tc>
@@ -301,7 +382,7 @@
                 <w:b/>
                 <w:bCs/>
               </w:rPr>
-              <w:t xml:space="preserve">Resultado da Fila 1: G/G/1</w:t>
+              <w:t>Resultado da Fila 1: G/G/1</w:t>
             </w:r>
             <w:r>
               <w:t>, chegadas entre</w:t>
@@ -346,11 +427,7 @@
             <w:tcW w:w="9629" w:type="dxa"/>
             <w:shd w:val="clear" w:color="auto" w:fill="FFFFFF" w:themeFill="background1"/>
           </w:tcPr>
-          <w:p>
-            <w:pPr>
-              <w:spacing w:after="0"/>
-            </w:pPr>
-          </w:p>
+          <w:p/>
           <w:tbl>
             <w:tblPr>
               <w:tblStyle w:val="TableGrid"/>
@@ -364,6 +441,9 @@
               <w:gridCol w:w="2200"/>
             </w:tblGrid>
             <w:tr>
+              <w:trPr>
+                <w:jc w:val="center"/>
+              </w:trPr>
               <w:tc>
                 <w:tcPr>
                   <w:tcW w:w="1400" w:type="dxa"/>
@@ -371,7 +451,6 @@
                 </w:tcPr>
                 <w:p>
                   <w:pPr>
-                    <w:spacing w:after="0"/>
                     <w:jc w:val="center"/>
                   </w:pPr>
                   <w:r>
@@ -379,7 +458,7 @@
                       <w:b/>
                       <w:bCs/>
                     </w:rPr>
-                    <w:t xml:space="preserve">Estado</w:t>
+                    <w:t>Estado</w:t>
                   </w:r>
                 </w:p>
               </w:tc>
@@ -390,7 +469,6 @@
                 </w:tcPr>
                 <w:p>
                   <w:pPr>
-                    <w:spacing w:after="0"/>
                     <w:jc w:val="center"/>
                   </w:pPr>
                   <w:r>
@@ -398,7 +476,7 @@
                       <w:b/>
                       <w:bCs/>
                     </w:rPr>
-                    <w:t xml:space="preserve">Tempo acumulado</w:t>
+                    <w:t>Tempo acumulado</w:t>
                   </w:r>
                 </w:p>
               </w:tc>
@@ -409,7 +487,6 @@
                 </w:tcPr>
                 <w:p>
                   <w:pPr>
-                    <w:spacing w:after="0"/>
                     <w:jc w:val="center"/>
                   </w:pPr>
                   <w:r>
@@ -417,23 +494,25 @@
                       <w:b/>
                       <w:bCs/>
                     </w:rPr>
-                    <w:t xml:space="preserve">Probabilidade</w:t>
+                    <w:t>Probabilidade</w:t>
                   </w:r>
                 </w:p>
               </w:tc>
             </w:tr>
             <w:tr>
+              <w:trPr>
+                <w:jc w:val="center"/>
+              </w:trPr>
               <w:tc>
                 <w:tcPr>
                   <w:tcW w:w="1400" w:type="dxa"/>
                 </w:tcPr>
                 <w:p>
                   <w:pPr>
-                    <w:spacing w:after="0"/>
                     <w:jc w:val="center"/>
                   </w:pPr>
                   <w:r>
-                    <w:t xml:space="preserve">0</w:t>
+                    <w:t>0</w:t>
                   </w:r>
                 </w:p>
               </w:tc>
@@ -443,11 +522,10 @@
                 </w:tcPr>
                 <w:p>
                   <w:pPr>
-                    <w:spacing w:after="0"/>
                     <w:jc w:val="right"/>
                   </w:pPr>
                   <w:r>
-                    <w:t xml:space="preserve">20672.9421</w:t>
+                    <w:t>20672.9421</w:t>
                   </w:r>
                 </w:p>
               </w:tc>
@@ -457,27 +535,28 @@
                 </w:tcPr>
                 <w:p>
                   <w:pPr>
-                    <w:spacing w:after="0"/>
                     <w:jc w:val="right"/>
                   </w:pPr>
                   <w:r>
-                    <w:t xml:space="preserve">40.54%</w:t>
+                    <w:t>40.54%</w:t>
                   </w:r>
                 </w:p>
               </w:tc>
             </w:tr>
             <w:tr>
+              <w:trPr>
+                <w:jc w:val="center"/>
+              </w:trPr>
               <w:tc>
                 <w:tcPr>
                   <w:tcW w:w="1400" w:type="dxa"/>
                 </w:tcPr>
                 <w:p>
                   <w:pPr>
-                    <w:spacing w:after="0"/>
                     <w:jc w:val="center"/>
                   </w:pPr>
                   <w:r>
-                    <w:t xml:space="preserve">1</w:t>
+                    <w:t>1</w:t>
                   </w:r>
                 </w:p>
               </w:tc>
@@ -487,11 +566,10 @@
                 </w:tcPr>
                 <w:p>
                   <w:pPr>
-                    <w:spacing w:after="0"/>
                     <w:jc w:val="right"/>
                   </w:pPr>
                   <w:r>
-                    <w:t xml:space="preserve">26665.0884</w:t>
+                    <w:t>26665.0884</w:t>
                   </w:r>
                 </w:p>
               </w:tc>
@@ -501,27 +579,28 @@
                 </w:tcPr>
                 <w:p>
                   <w:pPr>
-                    <w:spacing w:after="0"/>
                     <w:jc w:val="right"/>
                   </w:pPr>
                   <w:r>
-                    <w:t xml:space="preserve">52.29%</w:t>
+                    <w:t>52.29%</w:t>
                   </w:r>
                 </w:p>
               </w:tc>
             </w:tr>
             <w:tr>
+              <w:trPr>
+                <w:jc w:val="center"/>
+              </w:trPr>
               <w:tc>
                 <w:tcPr>
                   <w:tcW w:w="1400" w:type="dxa"/>
                 </w:tcPr>
                 <w:p>
                   <w:pPr>
-                    <w:spacing w:after="0"/>
                     <w:jc w:val="center"/>
                   </w:pPr>
                   <w:r>
-                    <w:t xml:space="preserve">2</w:t>
+                    <w:t>2</w:t>
                   </w:r>
                 </w:p>
               </w:tc>
@@ -531,11 +610,10 @@
                 </w:tcPr>
                 <w:p>
                   <w:pPr>
-                    <w:spacing w:after="0"/>
                     <w:jc w:val="right"/>
                   </w:pPr>
                   <w:r>
-                    <w:t xml:space="preserve">3505.0637</w:t>
+                    <w:t>3505.0637</w:t>
                   </w:r>
                 </w:p>
               </w:tc>
@@ -545,27 +623,28 @@
                 </w:tcPr>
                 <w:p>
                   <w:pPr>
-                    <w:spacing w:after="0"/>
                     <w:jc w:val="right"/>
                   </w:pPr>
                   <w:r>
-                    <w:t xml:space="preserve">6.87%</w:t>
+                    <w:t>6.87%</w:t>
                   </w:r>
                 </w:p>
               </w:tc>
             </w:tr>
             <w:tr>
+              <w:trPr>
+                <w:jc w:val="center"/>
+              </w:trPr>
               <w:tc>
                 <w:tcPr>
                   <w:tcW w:w="1400" w:type="dxa"/>
                 </w:tcPr>
                 <w:p>
                   <w:pPr>
-                    <w:spacing w:after="0"/>
                     <w:jc w:val="center"/>
                   </w:pPr>
                   <w:r>
-                    <w:t xml:space="preserve">3</w:t>
+                    <w:t>3</w:t>
                   </w:r>
                 </w:p>
               </w:tc>
@@ -575,11 +654,10 @@
                 </w:tcPr>
                 <w:p>
                   <w:pPr>
-                    <w:spacing w:after="0"/>
                     <w:jc w:val="right"/>
                   </w:pPr>
                   <w:r>
-                    <w:t xml:space="preserve">145.6668</w:t>
+                    <w:t>145.6668</w:t>
                   </w:r>
                 </w:p>
               </w:tc>
@@ -589,27 +667,28 @@
                 </w:tcPr>
                 <w:p>
                   <w:pPr>
-                    <w:spacing w:after="0"/>
                     <w:jc w:val="right"/>
                   </w:pPr>
                   <w:r>
-                    <w:t xml:space="preserve">0.29%</w:t>
+                    <w:t>0.29%</w:t>
                   </w:r>
                 </w:p>
               </w:tc>
             </w:tr>
             <w:tr>
+              <w:trPr>
+                <w:jc w:val="center"/>
+              </w:trPr>
               <w:tc>
                 <w:tcPr>
                   <w:tcW w:w="1400" w:type="dxa"/>
                 </w:tcPr>
                 <w:p>
                   <w:pPr>
-                    <w:spacing w:after="0"/>
                     <w:jc w:val="center"/>
                   </w:pPr>
                   <w:r>
-                    <w:t xml:space="preserve">4</w:t>
+                    <w:t>4</w:t>
                   </w:r>
                 </w:p>
               </w:tc>
@@ -619,11 +698,10 @@
                 </w:tcPr>
                 <w:p>
                   <w:pPr>
-                    <w:spacing w:after="0"/>
                     <w:jc w:val="right"/>
                   </w:pPr>
                   <w:r>
-                    <w:t xml:space="preserve">1.3311</w:t>
+                    <w:t>1.3311</w:t>
                   </w:r>
                 </w:p>
               </w:tc>
@@ -633,11 +711,10 @@
                 </w:tcPr>
                 <w:p>
                   <w:pPr>
-                    <w:spacing w:after="0"/>
                     <w:jc w:val="right"/>
                   </w:pPr>
                   <w:r>
-                    <w:t xml:space="preserve">0.00%</w:t>
+                    <w:t>0.00%</w:t>
                   </w:r>
                 </w:p>
               </w:tc>
@@ -645,7 +722,7 @@
           </w:tbl>
           <w:p>
             <w:r>
-              <w:t xml:space="preserve">Perdas na Q1: 0</w:t>
+              <w:t>Perdas na Q1: 0</w:t>
             </w:r>
           </w:p>
         </w:tc>
@@ -670,7 +747,7 @@
                 <w:b/>
                 <w:bCs/>
               </w:rPr>
-              <w:t xml:space="preserve">Resultado da Fila 2: G/G/2/5</w:t>
+              <w:t>Resultado da Fila 2: G/G/2/5</w:t>
             </w:r>
             <w:r>
               <w:t>, atendimento entre</w:t>
@@ -695,11 +772,7 @@
             <w:tcW w:w="9629" w:type="dxa"/>
             <w:shd w:val="clear" w:color="auto" w:fill="FFFFFF" w:themeFill="background1"/>
           </w:tcPr>
-          <w:p>
-            <w:pPr>
-              <w:spacing w:after="0"/>
-            </w:pPr>
-          </w:p>
+          <w:p/>
           <w:tbl>
             <w:tblPr>
               <w:tblStyle w:val="TableGrid"/>
@@ -713,6 +786,9 @@
               <w:gridCol w:w="2200"/>
             </w:tblGrid>
             <w:tr>
+              <w:trPr>
+                <w:jc w:val="center"/>
+              </w:trPr>
               <w:tc>
                 <w:tcPr>
                   <w:tcW w:w="1400" w:type="dxa"/>
@@ -720,7 +796,6 @@
                 </w:tcPr>
                 <w:p>
                   <w:pPr>
-                    <w:spacing w:after="0"/>
                     <w:jc w:val="center"/>
                   </w:pPr>
                   <w:r>
@@ -728,7 +803,7 @@
                       <w:b/>
                       <w:bCs/>
                     </w:rPr>
-                    <w:t xml:space="preserve">Estado</w:t>
+                    <w:t>Estado</w:t>
                   </w:r>
                 </w:p>
               </w:tc>
@@ -739,7 +814,6 @@
                 </w:tcPr>
                 <w:p>
                   <w:pPr>
-                    <w:spacing w:after="0"/>
                     <w:jc w:val="center"/>
                   </w:pPr>
                   <w:r>
@@ -747,7 +821,7 @@
                       <w:b/>
                       <w:bCs/>
                     </w:rPr>
-                    <w:t xml:space="preserve">Tempo acumulado</w:t>
+                    <w:t>Tempo acumulado</w:t>
                   </w:r>
                 </w:p>
               </w:tc>
@@ -758,7 +832,6 @@
                 </w:tcPr>
                 <w:p>
                   <w:pPr>
-                    <w:spacing w:after="0"/>
                     <w:jc w:val="center"/>
                   </w:pPr>
                   <w:r>
@@ -766,23 +839,25 @@
                       <w:b/>
                       <w:bCs/>
                     </w:rPr>
-                    <w:t xml:space="preserve">Probabilidade</w:t>
+                    <w:t>Probabilidade</w:t>
                   </w:r>
                 </w:p>
               </w:tc>
             </w:tr>
             <w:tr>
+              <w:trPr>
+                <w:jc w:val="center"/>
+              </w:trPr>
               <w:tc>
                 <w:tcPr>
                   <w:tcW w:w="1400" w:type="dxa"/>
                 </w:tcPr>
                 <w:p>
                   <w:pPr>
-                    <w:spacing w:after="0"/>
                     <w:jc w:val="center"/>
                   </w:pPr>
                   <w:r>
-                    <w:t xml:space="preserve">0</w:t>
+                    <w:t>0</w:t>
                   </w:r>
                 </w:p>
               </w:tc>
@@ -792,11 +867,10 @@
                 </w:tcPr>
                 <w:p>
                   <w:pPr>
-                    <w:spacing w:after="0"/>
                     <w:jc w:val="right"/>
                   </w:pPr>
                   <w:r>
-                    <w:t xml:space="preserve">12632.2026</w:t>
+                    <w:t>12632.2026</w:t>
                   </w:r>
                 </w:p>
               </w:tc>
@@ -806,27 +880,28 @@
                 </w:tcPr>
                 <w:p>
                   <w:pPr>
-                    <w:spacing w:after="0"/>
                     <w:jc w:val="right"/>
                   </w:pPr>
                   <w:r>
-                    <w:t xml:space="preserve">24.77%</w:t>
+                    <w:t>24.77%</w:t>
                   </w:r>
                 </w:p>
               </w:tc>
             </w:tr>
             <w:tr>
+              <w:trPr>
+                <w:jc w:val="center"/>
+              </w:trPr>
               <w:tc>
                 <w:tcPr>
                   <w:tcW w:w="1400" w:type="dxa"/>
                 </w:tcPr>
                 <w:p>
                   <w:pPr>
-                    <w:spacing w:after="0"/>
                     <w:jc w:val="center"/>
                   </w:pPr>
                   <w:r>
-                    <w:t xml:space="preserve">1</w:t>
+                    <w:t>1</w:t>
                   </w:r>
                 </w:p>
               </w:tc>
@@ -836,11 +911,10 @@
                 </w:tcPr>
                 <w:p>
                   <w:pPr>
-                    <w:spacing w:after="0"/>
                     <w:jc w:val="right"/>
                   </w:pPr>
                   <w:r>
-                    <w:t xml:space="preserve">21217.2892</w:t>
+                    <w:t>21217.2892</w:t>
                   </w:r>
                 </w:p>
               </w:tc>
@@ -850,27 +924,28 @@
                 </w:tcPr>
                 <w:p>
                   <w:pPr>
-                    <w:spacing w:after="0"/>
                     <w:jc w:val="right"/>
                   </w:pPr>
                   <w:r>
-                    <w:t xml:space="preserve">41.61%</w:t>
+                    <w:t>41.61%</w:t>
                   </w:r>
                 </w:p>
               </w:tc>
             </w:tr>
             <w:tr>
+              <w:trPr>
+                <w:jc w:val="center"/>
+              </w:trPr>
               <w:tc>
                 <w:tcPr>
                   <w:tcW w:w="1400" w:type="dxa"/>
                 </w:tcPr>
                 <w:p>
                   <w:pPr>
-                    <w:spacing w:after="0"/>
                     <w:jc w:val="center"/>
                   </w:pPr>
                   <w:r>
-                    <w:t xml:space="preserve">2</w:t>
+                    <w:t>2</w:t>
                   </w:r>
                 </w:p>
               </w:tc>
@@ -880,11 +955,10 @@
                 </w:tcPr>
                 <w:p>
                   <w:pPr>
-                    <w:spacing w:after="0"/>
                     <w:jc w:val="right"/>
                   </w:pPr>
                   <w:r>
-                    <w:t xml:space="preserve">13026.7249</w:t>
+                    <w:t>13026.7249</w:t>
                   </w:r>
                 </w:p>
               </w:tc>
@@ -894,27 +968,28 @@
                 </w:tcPr>
                 <w:p>
                   <w:pPr>
-                    <w:spacing w:after="0"/>
                     <w:jc w:val="right"/>
                   </w:pPr>
                   <w:r>
-                    <w:t xml:space="preserve">25.55%</w:t>
+                    <w:t>25.55%</w:t>
                   </w:r>
                 </w:p>
               </w:tc>
             </w:tr>
             <w:tr>
+              <w:trPr>
+                <w:jc w:val="center"/>
+              </w:trPr>
               <w:tc>
                 <w:tcPr>
                   <w:tcW w:w="1400" w:type="dxa"/>
                 </w:tcPr>
                 <w:p>
                   <w:pPr>
-                    <w:spacing w:after="0"/>
                     <w:jc w:val="center"/>
                   </w:pPr>
                   <w:r>
-                    <w:t xml:space="preserve">3</w:t>
+                    <w:t>3</w:t>
                   </w:r>
                 </w:p>
               </w:tc>
@@ -924,11 +999,10 @@
                 </w:tcPr>
                 <w:p>
                   <w:pPr>
-                    <w:spacing w:after="0"/>
                     <w:jc w:val="right"/>
                   </w:pPr>
                   <w:r>
-                    <w:t xml:space="preserve">3533.6895</w:t>
+                    <w:t>3533.6895</w:t>
                   </w:r>
                 </w:p>
               </w:tc>
@@ -938,27 +1012,28 @@
                 </w:tcPr>
                 <w:p>
                   <w:pPr>
-                    <w:spacing w:after="0"/>
                     <w:jc w:val="right"/>
                   </w:pPr>
                   <w:r>
-                    <w:t xml:space="preserve">6.93%</w:t>
+                    <w:t>6.93%</w:t>
                   </w:r>
                 </w:p>
               </w:tc>
             </w:tr>
             <w:tr>
+              <w:trPr>
+                <w:jc w:val="center"/>
+              </w:trPr>
               <w:tc>
                 <w:tcPr>
                   <w:tcW w:w="1400" w:type="dxa"/>
                 </w:tcPr>
                 <w:p>
                   <w:pPr>
-                    <w:spacing w:after="0"/>
                     <w:jc w:val="center"/>
                   </w:pPr>
                   <w:r>
-                    <w:t xml:space="preserve">4</w:t>
+                    <w:t>4</w:t>
                   </w:r>
                 </w:p>
               </w:tc>
@@ -968,11 +1043,10 @@
                 </w:tcPr>
                 <w:p>
                   <w:pPr>
-                    <w:spacing w:after="0"/>
                     <w:jc w:val="right"/>
                   </w:pPr>
                   <w:r>
-                    <w:t xml:space="preserve">530.9652</w:t>
+                    <w:t>530.9652</w:t>
                   </w:r>
                 </w:p>
               </w:tc>
@@ -982,27 +1056,29 @@
                 </w:tcPr>
                 <w:p>
                   <w:pPr>
-                    <w:spacing w:after="0"/>
                     <w:jc w:val="right"/>
                   </w:pPr>
                   <w:r>
-                    <w:t xml:space="preserve">1.04%</w:t>
+                    <w:t>1.04%</w:t>
                   </w:r>
                 </w:p>
               </w:tc>
             </w:tr>
             <w:tr>
+              <w:trPr>
+                <w:jc w:val="center"/>
+              </w:trPr>
               <w:tc>
                 <w:tcPr>
                   <w:tcW w:w="1400" w:type="dxa"/>
                 </w:tcPr>
                 <w:p>
                   <w:pPr>
-                    <w:spacing w:after="0"/>
                     <w:jc w:val="center"/>
                   </w:pPr>
                   <w:r>
-                    <w:t xml:space="preserve">5</w:t>
+                    <w:lastRenderedPageBreak/>
+                    <w:t>5</w:t>
                   </w:r>
                 </w:p>
               </w:tc>
@@ -1012,11 +1088,10 @@
                 </w:tcPr>
                 <w:p>
                   <w:pPr>
-                    <w:spacing w:after="0"/>
                     <w:jc w:val="right"/>
                   </w:pPr>
                   <w:r>
-                    <w:t xml:space="preserve">49.2206</w:t>
+                    <w:t>49.2206</w:t>
                   </w:r>
                 </w:p>
               </w:tc>
@@ -1026,11 +1101,10 @@
                 </w:tcPr>
                 <w:p>
                   <w:pPr>
-                    <w:spacing w:after="0"/>
                     <w:jc w:val="right"/>
                   </w:pPr>
                   <w:r>
-                    <w:t xml:space="preserve">0.10%</w:t>
+                    <w:t>0.10%</w:t>
                   </w:r>
                 </w:p>
               </w:tc>
@@ -1038,7 +1112,7 @@
           </w:tbl>
           <w:p>
             <w:r>
-              <w:t xml:space="preserve">Perdas na Q2: 3</w:t>
+              <w:t>Perdas na Q2: 3</w:t>
             </w:r>
           </w:p>
         </w:tc>
@@ -1089,7 +1163,7 @@
                 <w:b/>
                 <w:bCs/>
               </w:rPr>
-              <w:t xml:space="preserve">Resultado da Fila 3: G/G/2/10</w:t>
+              <w:t>Resultado da Fila 3: G/G/2/10</w:t>
             </w:r>
             <w:r>
               <w:t>, atendimento entre</w:t>
@@ -1114,11 +1188,7 @@
             <w:tcW w:w="9629" w:type="dxa"/>
             <w:shd w:val="clear" w:color="auto" w:fill="FFFFFF" w:themeFill="background1"/>
           </w:tcPr>
-          <w:p>
-            <w:pPr>
-              <w:spacing w:after="0"/>
-            </w:pPr>
-          </w:p>
+          <w:p/>
           <w:tbl>
             <w:tblPr>
               <w:tblStyle w:val="TableGrid"/>
@@ -1132,6 +1202,9 @@
               <w:gridCol w:w="2200"/>
             </w:tblGrid>
             <w:tr>
+              <w:trPr>
+                <w:jc w:val="center"/>
+              </w:trPr>
               <w:tc>
                 <w:tcPr>
                   <w:tcW w:w="1400" w:type="dxa"/>
@@ -1139,7 +1212,6 @@
                 </w:tcPr>
                 <w:p>
                   <w:pPr>
-                    <w:spacing w:after="0"/>
                     <w:jc w:val="center"/>
                   </w:pPr>
                   <w:r>
@@ -1147,7 +1219,7 @@
                       <w:b/>
                       <w:bCs/>
                     </w:rPr>
-                    <w:t xml:space="preserve">Estado</w:t>
+                    <w:t>Estado</w:t>
                   </w:r>
                 </w:p>
               </w:tc>
@@ -1158,7 +1230,6 @@
                 </w:tcPr>
                 <w:p>
                   <w:pPr>
-                    <w:spacing w:after="0"/>
                     <w:jc w:val="center"/>
                   </w:pPr>
                   <w:r>
@@ -1166,7 +1237,7 @@
                       <w:b/>
                       <w:bCs/>
                     </w:rPr>
-                    <w:t xml:space="preserve">Tempo acumulado</w:t>
+                    <w:t>Tempo acumulado</w:t>
                   </w:r>
                 </w:p>
               </w:tc>
@@ -1177,7 +1248,6 @@
                 </w:tcPr>
                 <w:p>
                   <w:pPr>
-                    <w:spacing w:after="0"/>
                     <w:jc w:val="center"/>
                   </w:pPr>
                   <w:r>
@@ -1185,23 +1255,25 @@
                       <w:b/>
                       <w:bCs/>
                     </w:rPr>
-                    <w:t xml:space="preserve">Probabilidade</w:t>
+                    <w:t>Probabilidade</w:t>
                   </w:r>
                 </w:p>
               </w:tc>
             </w:tr>
             <w:tr>
+              <w:trPr>
+                <w:jc w:val="center"/>
+              </w:trPr>
               <w:tc>
                 <w:tcPr>
                   <w:tcW w:w="1400" w:type="dxa"/>
                 </w:tcPr>
                 <w:p>
                   <w:pPr>
-                    <w:spacing w:after="0"/>
                     <w:jc w:val="center"/>
                   </w:pPr>
                   <w:r>
-                    <w:t xml:space="preserve">0</w:t>
+                    <w:t>0</w:t>
                   </w:r>
                 </w:p>
               </w:tc>
@@ -1211,11 +1283,10 @@
                 </w:tcPr>
                 <w:p>
                   <w:pPr>
-                    <w:spacing w:after="0"/>
                     <w:jc w:val="right"/>
                   </w:pPr>
                   <w:r>
-                    <w:t xml:space="preserve">6.1802</w:t>
+                    <w:t>6.1802</w:t>
                   </w:r>
                 </w:p>
               </w:tc>
@@ -1225,27 +1296,28 @@
                 </w:tcPr>
                 <w:p>
                   <w:pPr>
-                    <w:spacing w:after="0"/>
                     <w:jc w:val="right"/>
                   </w:pPr>
                   <w:r>
-                    <w:t xml:space="preserve">0.01%</w:t>
+                    <w:t>0.01%</w:t>
                   </w:r>
                 </w:p>
               </w:tc>
             </w:tr>
             <w:tr>
+              <w:trPr>
+                <w:jc w:val="center"/>
+              </w:trPr>
               <w:tc>
                 <w:tcPr>
                   <w:tcW w:w="1400" w:type="dxa"/>
                 </w:tcPr>
                 <w:p>
                   <w:pPr>
-                    <w:spacing w:after="0"/>
                     <w:jc w:val="center"/>
                   </w:pPr>
                   <w:r>
-                    <w:t xml:space="preserve">1</w:t>
+                    <w:t>1</w:t>
                   </w:r>
                 </w:p>
               </w:tc>
@@ -1255,11 +1327,10 @@
                 </w:tcPr>
                 <w:p>
                   <w:pPr>
-                    <w:spacing w:after="0"/>
                     <w:jc w:val="right"/>
                   </w:pPr>
                   <w:r>
-                    <w:t xml:space="preserve">4.2276</w:t>
+                    <w:t>4.2276</w:t>
                   </w:r>
                 </w:p>
               </w:tc>
@@ -1269,27 +1340,28 @@
                 </w:tcPr>
                 <w:p>
                   <w:pPr>
-                    <w:spacing w:after="0"/>
                     <w:jc w:val="right"/>
                   </w:pPr>
                   <w:r>
-                    <w:t xml:space="preserve">0.01%</w:t>
+                    <w:t>0.01%</w:t>
                   </w:r>
                 </w:p>
               </w:tc>
             </w:tr>
             <w:tr>
+              <w:trPr>
+                <w:jc w:val="center"/>
+              </w:trPr>
               <w:tc>
                 <w:tcPr>
                   <w:tcW w:w="1400" w:type="dxa"/>
                 </w:tcPr>
                 <w:p>
                   <w:pPr>
-                    <w:spacing w:after="0"/>
                     <w:jc w:val="center"/>
                   </w:pPr>
                   <w:r>
-                    <w:t xml:space="preserve">2</w:t>
+                    <w:t>2</w:t>
                   </w:r>
                 </w:p>
               </w:tc>
@@ -1299,11 +1371,10 @@
                 </w:tcPr>
                 <w:p>
                   <w:pPr>
-                    <w:spacing w:after="0"/>
                     <w:jc w:val="right"/>
                   </w:pPr>
                   <w:r>
-                    <w:t xml:space="preserve">7.9051</w:t>
+                    <w:t>7.9051</w:t>
                   </w:r>
                 </w:p>
               </w:tc>
@@ -1313,27 +1384,28 @@
                 </w:tcPr>
                 <w:p>
                   <w:pPr>
-                    <w:spacing w:after="0"/>
                     <w:jc w:val="right"/>
                   </w:pPr>
                   <w:r>
-                    <w:t xml:space="preserve">0.02%</w:t>
+                    <w:t>0.02%</w:t>
                   </w:r>
                 </w:p>
               </w:tc>
             </w:tr>
             <w:tr>
+              <w:trPr>
+                <w:jc w:val="center"/>
+              </w:trPr>
               <w:tc>
                 <w:tcPr>
                   <w:tcW w:w="1400" w:type="dxa"/>
                 </w:tcPr>
                 <w:p>
                   <w:pPr>
-                    <w:spacing w:after="0"/>
                     <w:jc w:val="center"/>
                   </w:pPr>
                   <w:r>
-                    <w:t xml:space="preserve">3</w:t>
+                    <w:t>3</w:t>
                   </w:r>
                 </w:p>
               </w:tc>
@@ -1343,11 +1415,10 @@
                 </w:tcPr>
                 <w:p>
                   <w:pPr>
-                    <w:spacing w:after="0"/>
                     <w:jc w:val="right"/>
                   </w:pPr>
                   <w:r>
-                    <w:t xml:space="preserve">12.3038</w:t>
+                    <w:t>12.3038</w:t>
                   </w:r>
                 </w:p>
               </w:tc>
@@ -1357,27 +1428,28 @@
                 </w:tcPr>
                 <w:p>
                   <w:pPr>
-                    <w:spacing w:after="0"/>
                     <w:jc w:val="right"/>
                   </w:pPr>
                   <w:r>
-                    <w:t xml:space="preserve">0.02%</w:t>
+                    <w:t>0.02%</w:t>
                   </w:r>
                 </w:p>
               </w:tc>
             </w:tr>
             <w:tr>
+              <w:trPr>
+                <w:jc w:val="center"/>
+              </w:trPr>
               <w:tc>
                 <w:tcPr>
                   <w:tcW w:w="1400" w:type="dxa"/>
                 </w:tcPr>
                 <w:p>
                   <w:pPr>
-                    <w:spacing w:after="0"/>
                     <w:jc w:val="center"/>
                   </w:pPr>
                   <w:r>
-                    <w:t xml:space="preserve">4</w:t>
+                    <w:t>4</w:t>
                   </w:r>
                 </w:p>
               </w:tc>
@@ -1387,11 +1459,10 @@
                 </w:tcPr>
                 <w:p>
                   <w:pPr>
-                    <w:spacing w:after="0"/>
                     <w:jc w:val="right"/>
                   </w:pPr>
                   <w:r>
-                    <w:t xml:space="preserve">2.2809</w:t>
+                    <w:t>2.2809</w:t>
                   </w:r>
                 </w:p>
               </w:tc>
@@ -1401,27 +1472,28 @@
                 </w:tcPr>
                 <w:p>
                   <w:pPr>
-                    <w:spacing w:after="0"/>
                     <w:jc w:val="right"/>
                   </w:pPr>
                   <w:r>
-                    <w:t xml:space="preserve">0.00%</w:t>
+                    <w:t>0.00%</w:t>
                   </w:r>
                 </w:p>
               </w:tc>
             </w:tr>
             <w:tr>
+              <w:trPr>
+                <w:jc w:val="center"/>
+              </w:trPr>
               <w:tc>
                 <w:tcPr>
                   <w:tcW w:w="1400" w:type="dxa"/>
                 </w:tcPr>
                 <w:p>
                   <w:pPr>
-                    <w:spacing w:after="0"/>
                     <w:jc w:val="center"/>
                   </w:pPr>
                   <w:r>
-                    <w:t xml:space="preserve">5</w:t>
+                    <w:t>5</w:t>
                   </w:r>
                 </w:p>
               </w:tc>
@@ -1431,11 +1503,10 @@
                 </w:tcPr>
                 <w:p>
                   <w:pPr>
-                    <w:spacing w:after="0"/>
                     <w:jc w:val="right"/>
                   </w:pPr>
                   <w:r>
-                    <w:t xml:space="preserve">7.4466</w:t>
+                    <w:t>7.4466</w:t>
                   </w:r>
                 </w:p>
               </w:tc>
@@ -1445,27 +1516,28 @@
                 </w:tcPr>
                 <w:p>
                   <w:pPr>
-                    <w:spacing w:after="0"/>
                     <w:jc w:val="right"/>
                   </w:pPr>
                   <w:r>
-                    <w:t xml:space="preserve">0.01%</w:t>
+                    <w:t>0.01%</w:t>
                   </w:r>
                 </w:p>
               </w:tc>
             </w:tr>
             <w:tr>
+              <w:trPr>
+                <w:jc w:val="center"/>
+              </w:trPr>
               <w:tc>
                 <w:tcPr>
                   <w:tcW w:w="1400" w:type="dxa"/>
                 </w:tcPr>
                 <w:p>
                   <w:pPr>
-                    <w:spacing w:after="0"/>
                     <w:jc w:val="center"/>
                   </w:pPr>
                   <w:r>
-                    <w:t xml:space="preserve">6</w:t>
+                    <w:t>6</w:t>
                   </w:r>
                 </w:p>
               </w:tc>
@@ -1475,11 +1547,10 @@
                 </w:tcPr>
                 <w:p>
                   <w:pPr>
-                    <w:spacing w:after="0"/>
                     <w:jc w:val="right"/>
                   </w:pPr>
                   <w:r>
-                    <w:t xml:space="preserve">2.2934</w:t>
+                    <w:t>2.2934</w:t>
                   </w:r>
                 </w:p>
               </w:tc>
@@ -1489,27 +1560,28 @@
                 </w:tcPr>
                 <w:p>
                   <w:pPr>
-                    <w:spacing w:after="0"/>
                     <w:jc w:val="right"/>
                   </w:pPr>
                   <w:r>
-                    <w:t xml:space="preserve">0.00%</w:t>
+                    <w:t>0.00%</w:t>
                   </w:r>
                 </w:p>
               </w:tc>
             </w:tr>
             <w:tr>
+              <w:trPr>
+                <w:jc w:val="center"/>
+              </w:trPr>
               <w:tc>
                 <w:tcPr>
                   <w:tcW w:w="1400" w:type="dxa"/>
                 </w:tcPr>
                 <w:p>
                   <w:pPr>
-                    <w:spacing w:after="0"/>
                     <w:jc w:val="center"/>
                   </w:pPr>
                   <w:r>
-                    <w:t xml:space="preserve">7</w:t>
+                    <w:t>7</w:t>
                   </w:r>
                 </w:p>
               </w:tc>
@@ -1519,11 +1591,10 @@
                 </w:tcPr>
                 <w:p>
                   <w:pPr>
-                    <w:spacing w:after="0"/>
                     <w:jc w:val="right"/>
                   </w:pPr>
                   <w:r>
-                    <w:t xml:space="preserve">60.7843</w:t>
+                    <w:t>60.7843</w:t>
                   </w:r>
                 </w:p>
               </w:tc>
@@ -1533,27 +1604,28 @@
                 </w:tcPr>
                 <w:p>
                   <w:pPr>
-                    <w:spacing w:after="0"/>
                     <w:jc w:val="right"/>
                   </w:pPr>
                   <w:r>
-                    <w:t xml:space="preserve">0.12%</w:t>
+                    <w:t>0.12%</w:t>
                   </w:r>
                 </w:p>
               </w:tc>
             </w:tr>
             <w:tr>
+              <w:trPr>
+                <w:jc w:val="center"/>
+              </w:trPr>
               <w:tc>
                 <w:tcPr>
                   <w:tcW w:w="1400" w:type="dxa"/>
                 </w:tcPr>
                 <w:p>
                   <w:pPr>
-                    <w:spacing w:after="0"/>
                     <w:jc w:val="center"/>
                   </w:pPr>
                   <w:r>
-                    <w:t xml:space="preserve">8</w:t>
+                    <w:t>8</w:t>
                   </w:r>
                 </w:p>
               </w:tc>
@@ -1563,11 +1635,10 @@
                 </w:tcPr>
                 <w:p>
                   <w:pPr>
-                    <w:spacing w:after="0"/>
                     <w:jc w:val="right"/>
                   </w:pPr>
                   <w:r>
-                    <w:t xml:space="preserve">2875.7443</w:t>
+                    <w:t>2875.7443</w:t>
                   </w:r>
                 </w:p>
               </w:tc>
@@ -1577,27 +1648,28 @@
                 </w:tcPr>
                 <w:p>
                   <w:pPr>
-                    <w:spacing w:after="0"/>
                     <w:jc w:val="right"/>
                   </w:pPr>
                   <w:r>
-                    <w:t xml:space="preserve">5.64%</w:t>
+                    <w:t>5.64%</w:t>
                   </w:r>
                 </w:p>
               </w:tc>
             </w:tr>
             <w:tr>
+              <w:trPr>
+                <w:jc w:val="center"/>
+              </w:trPr>
               <w:tc>
                 <w:tcPr>
                   <w:tcW w:w="1400" w:type="dxa"/>
                 </w:tcPr>
                 <w:p>
                   <w:pPr>
-                    <w:spacing w:after="0"/>
                     <w:jc w:val="center"/>
                   </w:pPr>
                   <w:r>
-                    <w:t xml:space="preserve">9</w:t>
+                    <w:t>9</w:t>
                   </w:r>
                 </w:p>
               </w:tc>
@@ -1607,11 +1679,10 @@
                 </w:tcPr>
                 <w:p>
                   <w:pPr>
-                    <w:spacing w:after="0"/>
                     <w:jc w:val="right"/>
                   </w:pPr>
                   <w:r>
-                    <w:t xml:space="preserve">15862.1116</w:t>
+                    <w:t>15862.1116</w:t>
                   </w:r>
                 </w:p>
               </w:tc>
@@ -1621,27 +1692,28 @@
                 </w:tcPr>
                 <w:p>
                   <w:pPr>
-                    <w:spacing w:after="0"/>
                     <w:jc w:val="right"/>
                   </w:pPr>
                   <w:r>
-                    <w:t xml:space="preserve">31.11%</w:t>
+                    <w:t>31.11%</w:t>
                   </w:r>
                 </w:p>
               </w:tc>
             </w:tr>
             <w:tr>
+              <w:trPr>
+                <w:jc w:val="center"/>
+              </w:trPr>
               <w:tc>
                 <w:tcPr>
                   <w:tcW w:w="1400" w:type="dxa"/>
                 </w:tcPr>
                 <w:p>
                   <w:pPr>
-                    <w:spacing w:after="0"/>
                     <w:jc w:val="center"/>
                   </w:pPr>
                   <w:r>
-                    <w:t xml:space="preserve">10</w:t>
+                    <w:t>10</w:t>
                   </w:r>
                 </w:p>
               </w:tc>
@@ -1651,11 +1723,10 @@
                 </w:tcPr>
                 <w:p>
                   <w:pPr>
-                    <w:spacing w:after="0"/>
                     <w:jc w:val="right"/>
                   </w:pPr>
                   <w:r>
-                    <w:t xml:space="preserve">32148.8141</w:t>
+                    <w:t>32148.8141</w:t>
                   </w:r>
                 </w:p>
               </w:tc>
@@ -1665,11 +1736,10 @@
                 </w:tcPr>
                 <w:p>
                   <w:pPr>
-                    <w:spacing w:after="0"/>
                     <w:jc w:val="right"/>
                   </w:pPr>
                   <w:r>
-                    <w:t xml:space="preserve">63.05%</w:t>
+                    <w:t>63.05%</w:t>
                   </w:r>
                 </w:p>
               </w:tc>
@@ -1677,7 +1747,7 @@
           </w:tbl>
           <w:p>
             <w:r>
-              <w:t xml:space="preserve">Perdas na Q3: 11651</w:t>
+              <w:t>Perdas na Q3: 11651</w:t>
             </w:r>
           </w:p>
         </w:tc>
@@ -1724,12 +1794,12 @@
                 <w:b/>
                 <w:bCs/>
               </w:rPr>
-              <w:t xml:space="preserve">Tempo global da simulação: 50990.0920</w:t>
+              <w:t>Tempo global da simulação: 50990.0920</w:t>
             </w:r>
           </w:p>
           <w:p>
             <w:r>
-              <w:t xml:space="preserve">Simulação encerrada após o uso dos 100.000 números pseudoaleatórios.</w:t>
+              <w:t>Simulação encerrada após o uso dos 100.000 números pseudoaleatórios.</w:t>
             </w:r>
           </w:p>
           <w:p/>
@@ -1772,7 +1842,7 @@
 </file>
 
 <file path=word/endnotes.xml><?xml version="1.0" encoding="utf-8"?>
-<w:endnotes xmlns:wpc="http://schemas.microsoft.com/office/word/2010/wordprocessingCanvas" xmlns:cx="http://schemas.microsoft.com/office/drawing/2014/chartex" xmlns:cx1="http://schemas.microsoft.com/office/drawing/2015/9/8/chartex" xmlns:cx2="http://schemas.microsoft.com/office/drawing/2015/10/21/chartex" xmlns:cx3="http://schemas.microsoft.com/office/drawing/2016/5/9/chartex" xmlns:cx4="http://schemas.microsoft.com/office/drawing/2016/5/10/chartex" xmlns:cx5="http://schemas.microsoft.com/office/drawing/2016/5/11/chartex" xmlns:cx6="http://schemas.microsoft.com/office/drawing/2016/5/12/chartex" xmlns:cx7="http://schemas.microsoft.com/office/drawing/2016/5/13/chartex" xmlns:cx8="http://schemas.microsoft.com/office/drawing/2016/5/14/chartex" xmlns:mc="http://schemas.openxmlformats.org/markup-compatibility/2006" xmlns:aink="http://schemas.microsoft.com/office/drawing/2016/ink" xmlns:am3d="http://schemas.microsoft.com/office/drawing/2017/model3d" xmlns:o="urn:schemas-microsoft-com:office:office" xmlns:oel="http://schemas.microsoft.com/office/2019/extlst" xmlns:r="http://schemas.openxmlformats.org/officeDocument/2006/relationships" xmlns:m="http://schemas.openxmlformats.org/officeDocument/2006/math" xmlns:v="urn:schemas-microsoft-com:vml" xmlns:wp14="http://schemas.microsoft.com/office/word/2010/wordprocessingDrawing" xmlns:wp="http://schemas.openxmlformats.org/drawingml/2006/wordprocessingDrawing" xmlns:w10="urn:schemas-microsoft-com:office:word" xmlns:w="http://schemas.openxmlformats.org/wordprocessingml/2006/main" xmlns:w14="http://schemas.microsoft.com/office/word/2010/wordml" xmlns:w15="http://schemas.microsoft.com/office/word/2012/wordml" xmlns:w16cex="http://schemas.microsoft.com/office/word/2018/wordml/cex" xmlns:w16cid="http://schemas.microsoft.com/office/word/2016/wordml/cid" xmlns:w16="http://schemas.microsoft.com/office/word/2018/wordml" xmlns:w16du="http://schemas.microsoft.com/office/word/2023/wordml/word16du" xmlns:w16sdtdh="http://schemas.microsoft.com/office/word/2020/wordml/sdtdatahash" xmlns:w16sdtfl="http://schemas.microsoft.com/office/word/2024/wordml/sdtformatlock" xmlns:w16se="http://schemas.microsoft.com/office/word/2015/wordml/symex" xmlns:wpg="http://schemas.microsoft.com/office/word/2010/wordprocessingGroup" xmlns:wpi="http://schemas.microsoft.com/office/word/2010/wordprocessingInk" xmlns:wne="http://schemas.microsoft.com/office/word/2006/wordml" xmlns:wps="http://schemas.microsoft.com/office/word/2010/wordprocessingShape" mc:Ignorable="w14 w15 w16se w16cid w16 w16cex w16sdtdh w16sdtfl w16du wp14">
+<w:endnotes xmlns:wpc="http://schemas.microsoft.com/office/word/2010/wordprocessingCanvas" xmlns:cx="http://schemas.microsoft.com/office/drawing/2014/chartex" xmlns:cx1="http://schemas.microsoft.com/office/drawing/2015/9/8/chartex" xmlns:cx2="http://schemas.microsoft.com/office/drawing/2015/10/21/chartex" xmlns:cx3="http://schemas.microsoft.com/office/drawing/2016/5/9/chartex" xmlns:cx4="http://schemas.microsoft.com/office/drawing/2016/5/10/chartex" xmlns:cx5="http://schemas.microsoft.com/office/drawing/2016/5/11/chartex" xmlns:cx6="http://schemas.microsoft.com/office/drawing/2016/5/12/chartex" xmlns:cx7="http://schemas.microsoft.com/office/drawing/2016/5/13/chartex" xmlns:cx8="http://schemas.microsoft.com/office/drawing/2016/5/14/chartex" xmlns:mc="http://schemas.openxmlformats.org/markup-compatibility/2006" xmlns:aink="http://schemas.microsoft.com/office/drawing/2016/ink" xmlns:am3d="http://schemas.microsoft.com/office/drawing/2017/model3d" xmlns:o="urn:schemas-microsoft-com:office:office" xmlns:oel="http://schemas.microsoft.com/office/2019/extlst" xmlns:r="http://schemas.openxmlformats.org/officeDocument/2006/relationships" xmlns:m="http://schemas.openxmlformats.org/officeDocument/2006/math" xmlns:v="urn:schemas-microsoft-com:vml" xmlns:wp14="http://schemas.microsoft.com/office/word/2010/wordprocessingDrawing" xmlns:wp="http://schemas.openxmlformats.org/drawingml/2006/wordprocessingDrawing" xmlns:w10="urn:schemas-microsoft-com:office:word" xmlns:w="http://schemas.openxmlformats.org/wordprocessingml/2006/main" xmlns:w14="http://schemas.microsoft.com/office/word/2010/wordml" xmlns:w15="http://schemas.microsoft.com/office/word/2012/wordml" xmlns:w16cex="http://schemas.microsoft.com/office/word/2018/wordml/cex" xmlns:w16cid="http://schemas.microsoft.com/office/word/2016/wordml/cid" xmlns:w16="http://schemas.microsoft.com/office/word/2018/wordml" xmlns:w16du="http://schemas.microsoft.com/office/word/2023/wordml/word16du" xmlns:w16sdtdh="http://schemas.microsoft.com/office/word/2020/wordml/sdtdatahash" xmlns:w16se="http://schemas.microsoft.com/office/word/2015/wordml/symex" xmlns:wpg="http://schemas.microsoft.com/office/word/2010/wordprocessingGroup" xmlns:wpi="http://schemas.microsoft.com/office/word/2010/wordprocessingInk" xmlns:wne="http://schemas.microsoft.com/office/word/2006/wordml" xmlns:wps="http://schemas.microsoft.com/office/word/2010/wordprocessingShape" mc:Ignorable="w14 w15 w16se w16cid w16 w16cex w16sdtdh w16du wp14">
   <w:endnote w:type="separator" w:id="-1">
     <w:p>
       <w:pPr>
@@ -1797,7 +1867,7 @@
 </file>
 
 <file path=word/footnotes.xml><?xml version="1.0" encoding="utf-8"?>
-<w:footnotes xmlns:wpc="http://schemas.microsoft.com/office/word/2010/wordprocessingCanvas" xmlns:cx="http://schemas.microsoft.com/office/drawing/2014/chartex" xmlns:cx1="http://schemas.microsoft.com/office/drawing/2015/9/8/chartex" xmlns:cx2="http://schemas.microsoft.com/office/drawing/2015/10/21/chartex" xmlns:cx3="http://schemas.microsoft.com/office/drawing/2016/5/9/chartex" xmlns:cx4="http://schemas.microsoft.com/office/drawing/2016/5/10/chartex" xmlns:cx5="http://schemas.microsoft.com/office/drawing/2016/5/11/chartex" xmlns:cx6="http://schemas.microsoft.com/office/drawing/2016/5/12/chartex" xmlns:cx7="http://schemas.microsoft.com/office/drawing/2016/5/13/chartex" xmlns:cx8="http://schemas.microsoft.com/office/drawing/2016/5/14/chartex" xmlns:mc="http://schemas.openxmlformats.org/markup-compatibility/2006" xmlns:aink="http://schemas.microsoft.com/office/drawing/2016/ink" xmlns:am3d="http://schemas.microsoft.com/office/drawing/2017/model3d" xmlns:o="urn:schemas-microsoft-com:office:office" xmlns:oel="http://schemas.microsoft.com/office/2019/extlst" xmlns:r="http://schemas.openxmlformats.org/officeDocument/2006/relationships" xmlns:m="http://schemas.openxmlformats.org/officeDocument/2006/math" xmlns:v="urn:schemas-microsoft-com:vml" xmlns:wp14="http://schemas.microsoft.com/office/word/2010/wordprocessingDrawing" xmlns:wp="http://schemas.openxmlformats.org/drawingml/2006/wordprocessingDrawing" xmlns:w10="urn:schemas-microsoft-com:office:word" xmlns:w="http://schemas.openxmlformats.org/wordprocessingml/2006/main" xmlns:w14="http://schemas.microsoft.com/office/word/2010/wordml" xmlns:w15="http://schemas.microsoft.com/office/word/2012/wordml" xmlns:w16cex="http://schemas.microsoft.com/office/word/2018/wordml/cex" xmlns:w16cid="http://schemas.microsoft.com/office/word/2016/wordml/cid" xmlns:w16="http://schemas.microsoft.com/office/word/2018/wordml" xmlns:w16du="http://schemas.microsoft.com/office/word/2023/wordml/word16du" xmlns:w16sdtdh="http://schemas.microsoft.com/office/word/2020/wordml/sdtdatahash" xmlns:w16sdtfl="http://schemas.microsoft.com/office/word/2024/wordml/sdtformatlock" xmlns:w16se="http://schemas.microsoft.com/office/word/2015/wordml/symex" xmlns:wpg="http://schemas.microsoft.com/office/word/2010/wordprocessingGroup" xmlns:wpi="http://schemas.microsoft.com/office/word/2010/wordprocessingInk" xmlns:wne="http://schemas.microsoft.com/office/word/2006/wordml" xmlns:wps="http://schemas.microsoft.com/office/word/2010/wordprocessingShape" mc:Ignorable="w14 w15 w16se w16cid w16 w16cex w16sdtdh w16sdtfl w16du wp14">
+<w:footnotes xmlns:wpc="http://schemas.microsoft.com/office/word/2010/wordprocessingCanvas" xmlns:cx="http://schemas.microsoft.com/office/drawing/2014/chartex" xmlns:cx1="http://schemas.microsoft.com/office/drawing/2015/9/8/chartex" xmlns:cx2="http://schemas.microsoft.com/office/drawing/2015/10/21/chartex" xmlns:cx3="http://schemas.microsoft.com/office/drawing/2016/5/9/chartex" xmlns:cx4="http://schemas.microsoft.com/office/drawing/2016/5/10/chartex" xmlns:cx5="http://schemas.microsoft.com/office/drawing/2016/5/11/chartex" xmlns:cx6="http://schemas.microsoft.com/office/drawing/2016/5/12/chartex" xmlns:cx7="http://schemas.microsoft.com/office/drawing/2016/5/13/chartex" xmlns:cx8="http://schemas.microsoft.com/office/drawing/2016/5/14/chartex" xmlns:mc="http://schemas.openxmlformats.org/markup-compatibility/2006" xmlns:aink="http://schemas.microsoft.com/office/drawing/2016/ink" xmlns:am3d="http://schemas.microsoft.com/office/drawing/2017/model3d" xmlns:o="urn:schemas-microsoft-com:office:office" xmlns:oel="http://schemas.microsoft.com/office/2019/extlst" xmlns:r="http://schemas.openxmlformats.org/officeDocument/2006/relationships" xmlns:m="http://schemas.openxmlformats.org/officeDocument/2006/math" xmlns:v="urn:schemas-microsoft-com:vml" xmlns:wp14="http://schemas.microsoft.com/office/word/2010/wordprocessingDrawing" xmlns:wp="http://schemas.openxmlformats.org/drawingml/2006/wordprocessingDrawing" xmlns:w10="urn:schemas-microsoft-com:office:word" xmlns:w="http://schemas.openxmlformats.org/wordprocessingml/2006/main" xmlns:w14="http://schemas.microsoft.com/office/word/2010/wordml" xmlns:w15="http://schemas.microsoft.com/office/word/2012/wordml" xmlns:w16cex="http://schemas.microsoft.com/office/word/2018/wordml/cex" xmlns:w16cid="http://schemas.microsoft.com/office/word/2016/wordml/cid" xmlns:w16="http://schemas.microsoft.com/office/word/2018/wordml" xmlns:w16du="http://schemas.microsoft.com/office/word/2023/wordml/word16du" xmlns:w16sdtdh="http://schemas.microsoft.com/office/word/2020/wordml/sdtdatahash" xmlns:w16se="http://schemas.microsoft.com/office/word/2015/wordml/symex" xmlns:wpg="http://schemas.microsoft.com/office/word/2010/wordprocessingGroup" xmlns:wpi="http://schemas.microsoft.com/office/word/2010/wordprocessingInk" xmlns:wne="http://schemas.microsoft.com/office/word/2006/wordml" xmlns:wps="http://schemas.microsoft.com/office/word/2010/wordprocessingShape" mc:Ignorable="w14 w15 w16se w16cid w16 w16cex w16sdtdh w16du wp14">
   <w:footnote w:type="separator" w:id="-1">
     <w:p>
       <w:pPr>
@@ -1822,7 +1892,7 @@
 </file>
 
 <file path=word/header1.xml><?xml version="1.0" encoding="utf-8"?>
-<w:hdr xmlns:wpc="http://schemas.microsoft.com/office/word/2010/wordprocessingCanvas" xmlns:cx="http://schemas.microsoft.com/office/drawing/2014/chartex" xmlns:cx1="http://schemas.microsoft.com/office/drawing/2015/9/8/chartex" xmlns:cx2="http://schemas.microsoft.com/office/drawing/2015/10/21/chartex" xmlns:cx3="http://schemas.microsoft.com/office/drawing/2016/5/9/chartex" xmlns:cx4="http://schemas.microsoft.com/office/drawing/2016/5/10/chartex" xmlns:cx5="http://schemas.microsoft.com/office/drawing/2016/5/11/chartex" xmlns:cx6="http://schemas.microsoft.com/office/drawing/2016/5/12/chartex" xmlns:cx7="http://schemas.microsoft.com/office/drawing/2016/5/13/chartex" xmlns:cx8="http://schemas.microsoft.com/office/drawing/2016/5/14/chartex" xmlns:mc="http://schemas.openxmlformats.org/markup-compatibility/2006" xmlns:aink="http://schemas.microsoft.com/office/drawing/2016/ink" xmlns:am3d="http://schemas.microsoft.com/office/drawing/2017/model3d" xmlns:o="urn:schemas-microsoft-com:office:office" xmlns:oel="http://schemas.microsoft.com/office/2019/extlst" xmlns:r="http://schemas.openxmlformats.org/officeDocument/2006/relationships" xmlns:m="http://schemas.openxmlformats.org/officeDocument/2006/math" xmlns:v="urn:schemas-microsoft-com:vml" xmlns:wp14="http://schemas.microsoft.com/office/word/2010/wordprocessingDrawing" xmlns:wp="http://schemas.openxmlformats.org/drawingml/2006/wordprocessingDrawing" xmlns:w10="urn:schemas-microsoft-com:office:word" xmlns:w="http://schemas.openxmlformats.org/wordprocessingml/2006/main" xmlns:w14="http://schemas.microsoft.com/office/word/2010/wordml" xmlns:w15="http://schemas.microsoft.com/office/word/2012/wordml" xmlns:w16cex="http://schemas.microsoft.com/office/word/2018/wordml/cex" xmlns:w16cid="http://schemas.microsoft.com/office/word/2016/wordml/cid" xmlns:w16="http://schemas.microsoft.com/office/word/2018/wordml" xmlns:w16du="http://schemas.microsoft.com/office/word/2023/wordml/word16du" xmlns:w16sdtdh="http://schemas.microsoft.com/office/word/2020/wordml/sdtdatahash" xmlns:w16sdtfl="http://schemas.microsoft.com/office/word/2024/wordml/sdtformatlock" xmlns:w16se="http://schemas.microsoft.com/office/word/2015/wordml/symex" xmlns:wpg="http://schemas.microsoft.com/office/word/2010/wordprocessingGroup" xmlns:wpi="http://schemas.microsoft.com/office/word/2010/wordprocessingInk" xmlns:wne="http://schemas.microsoft.com/office/word/2006/wordml" xmlns:wps="http://schemas.microsoft.com/office/word/2010/wordprocessingShape" mc:Ignorable="w14 w15 w16se w16cid w16 w16cex w16sdtdh w16sdtfl w16du wp14">
+<w:hdr xmlns:wpc="http://schemas.microsoft.com/office/word/2010/wordprocessingCanvas" xmlns:cx="http://schemas.microsoft.com/office/drawing/2014/chartex" xmlns:cx1="http://schemas.microsoft.com/office/drawing/2015/9/8/chartex" xmlns:cx2="http://schemas.microsoft.com/office/drawing/2015/10/21/chartex" xmlns:cx3="http://schemas.microsoft.com/office/drawing/2016/5/9/chartex" xmlns:cx4="http://schemas.microsoft.com/office/drawing/2016/5/10/chartex" xmlns:cx5="http://schemas.microsoft.com/office/drawing/2016/5/11/chartex" xmlns:cx6="http://schemas.microsoft.com/office/drawing/2016/5/12/chartex" xmlns:cx7="http://schemas.microsoft.com/office/drawing/2016/5/13/chartex" xmlns:cx8="http://schemas.microsoft.com/office/drawing/2016/5/14/chartex" xmlns:mc="http://schemas.openxmlformats.org/markup-compatibility/2006" xmlns:aink="http://schemas.microsoft.com/office/drawing/2016/ink" xmlns:am3d="http://schemas.microsoft.com/office/drawing/2017/model3d" xmlns:o="urn:schemas-microsoft-com:office:office" xmlns:oel="http://schemas.microsoft.com/office/2019/extlst" xmlns:r="http://schemas.openxmlformats.org/officeDocument/2006/relationships" xmlns:m="http://schemas.openxmlformats.org/officeDocument/2006/math" xmlns:v="urn:schemas-microsoft-com:vml" xmlns:wp14="http://schemas.microsoft.com/office/word/2010/wordprocessingDrawing" xmlns:wp="http://schemas.openxmlformats.org/drawingml/2006/wordprocessingDrawing" xmlns:w10="urn:schemas-microsoft-com:office:word" xmlns:w="http://schemas.openxmlformats.org/wordprocessingml/2006/main" xmlns:w14="http://schemas.microsoft.com/office/word/2010/wordml" xmlns:w15="http://schemas.microsoft.com/office/word/2012/wordml" xmlns:w16cex="http://schemas.microsoft.com/office/word/2018/wordml/cex" xmlns:w16cid="http://schemas.microsoft.com/office/word/2016/wordml/cid" xmlns:w16="http://schemas.microsoft.com/office/word/2018/wordml" xmlns:w16du="http://schemas.microsoft.com/office/word/2023/wordml/word16du" xmlns:w16sdtdh="http://schemas.microsoft.com/office/word/2020/wordml/sdtdatahash" xmlns:w16se="http://schemas.microsoft.com/office/word/2015/wordml/symex" xmlns:wpg="http://schemas.microsoft.com/office/word/2010/wordprocessingGroup" xmlns:wpi="http://schemas.microsoft.com/office/word/2010/wordprocessingInk" xmlns:wne="http://schemas.microsoft.com/office/word/2006/wordml" xmlns:wps="http://schemas.microsoft.com/office/word/2010/wordprocessingShape" mc:Ignorable="w14 w15 w16se w16cid w16 w16cex w16sdtdh w16du wp14">
   <w:p>
     <w:pPr>
       <w:pStyle w:val="Header"/>
@@ -1833,7 +1903,7 @@
         <w:lang w:eastAsia="pt-BR"/>
       </w:rPr>
       <w:drawing>
-        <wp:anchor distT="0" distB="0" distL="114300" distR="114300" simplePos="0" relativeHeight="251659264" behindDoc="0" locked="0" layoutInCell="1" allowOverlap="1" wp14:anchorId="0401DB08" wp14:editId="69FCC6B2">
+        <wp:anchor distT="0" distB="0" distL="114300" distR="114300" simplePos="0" relativeHeight="251659264" behindDoc="0" locked="0" layoutInCell="1" allowOverlap="1" wp14:anchorId="660C2FB8" wp14:editId="7C8F85F9">
           <wp:simplePos x="0" y="0"/>
           <wp:positionH relativeFrom="page">
             <wp:posOffset>70485</wp:posOffset>
@@ -1898,7 +1968,7 @@
 </file>
 
 <file path=word/numbering.xml><?xml version="1.0" encoding="utf-8"?>
-<w:numbering xmlns:wpc="http://schemas.microsoft.com/office/word/2010/wordprocessingCanvas" xmlns:cx="http://schemas.microsoft.com/office/drawing/2014/chartex" xmlns:cx1="http://schemas.microsoft.com/office/drawing/2015/9/8/chartex" xmlns:cx2="http://schemas.microsoft.com/office/drawing/2015/10/21/chartex" xmlns:cx3="http://schemas.microsoft.com/office/drawing/2016/5/9/chartex" xmlns:cx4="http://schemas.microsoft.com/office/drawing/2016/5/10/chartex" xmlns:cx5="http://schemas.microsoft.com/office/drawing/2016/5/11/chartex" xmlns:cx6="http://schemas.microsoft.com/office/drawing/2016/5/12/chartex" xmlns:cx7="http://schemas.microsoft.com/office/drawing/2016/5/13/chartex" xmlns:cx8="http://schemas.microsoft.com/office/drawing/2016/5/14/chartex" xmlns:mc="http://schemas.openxmlformats.org/markup-compatibility/2006" xmlns:aink="http://schemas.microsoft.com/office/drawing/2016/ink" xmlns:am3d="http://schemas.microsoft.com/office/drawing/2017/model3d" xmlns:o="urn:schemas-microsoft-com:office:office" xmlns:oel="http://schemas.microsoft.com/office/2019/extlst" xmlns:r="http://schemas.openxmlformats.org/officeDocument/2006/relationships" xmlns:m="http://schemas.openxmlformats.org/officeDocument/2006/math" xmlns:v="urn:schemas-microsoft-com:vml" xmlns:wp14="http://schemas.microsoft.com/office/word/2010/wordprocessingDrawing" xmlns:wp="http://schemas.openxmlformats.org/drawingml/2006/wordprocessingDrawing" xmlns:w10="urn:schemas-microsoft-com:office:word" xmlns:w="http://schemas.openxmlformats.org/wordprocessingml/2006/main" xmlns:w14="http://schemas.microsoft.com/office/word/2010/wordml" xmlns:w15="http://schemas.microsoft.com/office/word/2012/wordml" xmlns:w16cex="http://schemas.microsoft.com/office/word/2018/wordml/cex" xmlns:w16cid="http://schemas.microsoft.com/office/word/2016/wordml/cid" xmlns:w16="http://schemas.microsoft.com/office/word/2018/wordml" xmlns:w16du="http://schemas.microsoft.com/office/word/2023/wordml/word16du" xmlns:w16sdtdh="http://schemas.microsoft.com/office/word/2020/wordml/sdtdatahash" xmlns:w16sdtfl="http://schemas.microsoft.com/office/word/2024/wordml/sdtformatlock" xmlns:w16se="http://schemas.microsoft.com/office/word/2015/wordml/symex" xmlns:wpg="http://schemas.microsoft.com/office/word/2010/wordprocessingGroup" xmlns:wpi="http://schemas.microsoft.com/office/word/2010/wordprocessingInk" xmlns:wne="http://schemas.microsoft.com/office/word/2006/wordml" xmlns:wps="http://schemas.microsoft.com/office/word/2010/wordprocessingShape" mc:Ignorable="w14 w15 w16se w16cid w16 w16cex w16sdtdh w16sdtfl w16du wp14">
+<w:numbering xmlns:wpc="http://schemas.microsoft.com/office/word/2010/wordprocessingCanvas" xmlns:cx="http://schemas.microsoft.com/office/drawing/2014/chartex" xmlns:cx1="http://schemas.microsoft.com/office/drawing/2015/9/8/chartex" xmlns:cx2="http://schemas.microsoft.com/office/drawing/2015/10/21/chartex" xmlns:cx3="http://schemas.microsoft.com/office/drawing/2016/5/9/chartex" xmlns:cx4="http://schemas.microsoft.com/office/drawing/2016/5/10/chartex" xmlns:cx5="http://schemas.microsoft.com/office/drawing/2016/5/11/chartex" xmlns:cx6="http://schemas.microsoft.com/office/drawing/2016/5/12/chartex" xmlns:cx7="http://schemas.microsoft.com/office/drawing/2016/5/13/chartex" xmlns:cx8="http://schemas.microsoft.com/office/drawing/2016/5/14/chartex" xmlns:mc="http://schemas.openxmlformats.org/markup-compatibility/2006" xmlns:aink="http://schemas.microsoft.com/office/drawing/2016/ink" xmlns:am3d="http://schemas.microsoft.com/office/drawing/2017/model3d" xmlns:o="urn:schemas-microsoft-com:office:office" xmlns:oel="http://schemas.microsoft.com/office/2019/extlst" xmlns:r="http://schemas.openxmlformats.org/officeDocument/2006/relationships" xmlns:m="http://schemas.openxmlformats.org/officeDocument/2006/math" xmlns:v="urn:schemas-microsoft-com:vml" xmlns:wp14="http://schemas.microsoft.com/office/word/2010/wordprocessingDrawing" xmlns:wp="http://schemas.openxmlformats.org/drawingml/2006/wordprocessingDrawing" xmlns:w10="urn:schemas-microsoft-com:office:word" xmlns:w="http://schemas.openxmlformats.org/wordprocessingml/2006/main" xmlns:w14="http://schemas.microsoft.com/office/word/2010/wordml" xmlns:w15="http://schemas.microsoft.com/office/word/2012/wordml" xmlns:w16cex="http://schemas.microsoft.com/office/word/2018/wordml/cex" xmlns:w16cid="http://schemas.microsoft.com/office/word/2016/wordml/cid" xmlns:w16="http://schemas.microsoft.com/office/word/2018/wordml" xmlns:w16du="http://schemas.microsoft.com/office/word/2023/wordml/word16du" xmlns:w16sdtdh="http://schemas.microsoft.com/office/word/2020/wordml/sdtdatahash" xmlns:w16se="http://schemas.microsoft.com/office/word/2015/wordml/symex" xmlns:wpg="http://schemas.microsoft.com/office/word/2010/wordprocessingGroup" xmlns:wpi="http://schemas.microsoft.com/office/word/2010/wordprocessingInk" xmlns:wne="http://schemas.microsoft.com/office/word/2006/wordml" xmlns:wps="http://schemas.microsoft.com/office/word/2010/wordprocessingShape" mc:Ignorable="w14 w15 w16se w16cid w16 w16cex w16sdtdh w16du wp14">
   <w:abstractNum w:abstractNumId="0" w15:restartNumberingAfterBreak="0">
     <w:nsid w:val="06CE4B87"/>
     <w:multiLevelType w:val="hybridMultilevel"/>
@@ -2622,7 +2692,7 @@
 </file>
 
 <file path=word/styles.xml><?xml version="1.0" encoding="utf-8"?>
-<w:styles xmlns:mc="http://schemas.openxmlformats.org/markup-compatibility/2006" xmlns:r="http://schemas.openxmlformats.org/officeDocument/2006/relationships" xmlns:w="http://schemas.openxmlformats.org/wordprocessingml/2006/main" xmlns:w14="http://schemas.microsoft.com/office/word/2010/wordml" xmlns:w15="http://schemas.microsoft.com/office/word/2012/wordml" xmlns:w16cex="http://schemas.microsoft.com/office/word/2018/wordml/cex" xmlns:w16cid="http://schemas.microsoft.com/office/word/2016/wordml/cid" xmlns:w16="http://schemas.microsoft.com/office/word/2018/wordml" xmlns:w16du="http://schemas.microsoft.com/office/word/2023/wordml/word16du" xmlns:w16sdtdh="http://schemas.microsoft.com/office/word/2020/wordml/sdtdatahash" xmlns:w16sdtfl="http://schemas.microsoft.com/office/word/2024/wordml/sdtformatlock" xmlns:w16se="http://schemas.microsoft.com/office/word/2015/wordml/symex" mc:Ignorable="w14 w15 w16se w16cid w16 w16cex w16sdtdh w16sdtfl w16du">
+<w:styles xmlns:mc="http://schemas.openxmlformats.org/markup-compatibility/2006" xmlns:r="http://schemas.openxmlformats.org/officeDocument/2006/relationships" xmlns:w="http://schemas.openxmlformats.org/wordprocessingml/2006/main" xmlns:w14="http://schemas.microsoft.com/office/word/2010/wordml" xmlns:w15="http://schemas.microsoft.com/office/word/2012/wordml" xmlns:w16cex="http://schemas.microsoft.com/office/word/2018/wordml/cex" xmlns:w16cid="http://schemas.microsoft.com/office/word/2016/wordml/cid" xmlns:w16="http://schemas.microsoft.com/office/word/2018/wordml" xmlns:w16du="http://schemas.microsoft.com/office/word/2023/wordml/word16du" xmlns:w16sdtdh="http://schemas.microsoft.com/office/word/2020/wordml/sdtdatahash" xmlns:w16se="http://schemas.microsoft.com/office/word/2015/wordml/symex" mc:Ignorable="w14 w15 w16se w16cid w16 w16cex w16sdtdh w16du">
   <w:docDefaults>
     <w:rPrDefault>
       <w:rPr>
@@ -3024,7 +3094,6 @@
   <w:style w:type="character" w:default="1" w:styleId="DefaultParagraphFont">
     <w:name w:val="Default Paragraph Font"/>
     <w:uiPriority w:val="1"/>
-    <w:semiHidden/>
     <w:unhideWhenUsed/>
   </w:style>
   <w:style w:type="table" w:default="1" w:styleId="TableNormal">
@@ -3989,6 +4058,23 @@
 </file>
 
 <file path=customXml/item1.xml><?xml version="1.0" encoding="utf-8"?>
+<?mso-contentType ?>
+<FormTemplates xmlns="http://schemas.microsoft.com/sharepoint/v3/contenttype/forms">
+  <Display>DocumentLibraryForm</Display>
+  <Edit>DocumentLibraryForm</Edit>
+  <New>DocumentLibraryForm</New>
+</FormTemplates>
+</file>
+
+<file path=customXml/item2.xml><?xml version="1.0" encoding="utf-8"?>
+<p:properties xmlns:p="http://schemas.microsoft.com/office/2006/metadata/properties" xmlns:xsi="http://www.w3.org/2001/XMLSchema-instance" xmlns:pc="http://schemas.microsoft.com/office/infopath/2007/PartnerControls">
+  <documentManagement>
+    <_activity xmlns="5e56eec9-9a2e-4f24-bab5-2b965ebe6664" xsi:nil="true"/>
+  </documentManagement>
+</p:properties>
+</file>
+
+<file path=customXml/item3.xml><?xml version="1.0" encoding="utf-8"?>
 <ct:contentTypeSchema xmlns:ct="http://schemas.microsoft.com/office/2006/metadata/contentType" xmlns:ma="http://schemas.microsoft.com/office/2006/metadata/properties/metaAttributes" ct:_="" ma:_="" ma:contentTypeName="Documento" ma:contentTypeID="0x010100FDA918729A14AC479D87ADAE1A219B66" ma:contentTypeVersion="18" ma:contentTypeDescription="Crie um novo documento." ma:contentTypeScope="" ma:versionID="bf65b13cbe772009898667f95c13b368">
   <xsd:schema xmlns:xsd="http://www.w3.org/2001/XMLSchema" xmlns:xs="http://www.w3.org/2001/XMLSchema" xmlns:p="http://schemas.microsoft.com/office/2006/metadata/properties" xmlns:ns3="5e56eec9-9a2e-4f24-bab5-2b965ebe6664" xmlns:ns4="54e5cc6f-ecb7-48b3-b122-284322b940a7" targetNamespace="http://schemas.microsoft.com/office/2006/metadata/properties" ma:root="true" ma:fieldsID="4f2f32ee2aeebe7360237ea1462cb9ce" ns3:_="" ns4:_="">
     <xsd:import namespace="5e56eec9-9a2e-4f24-bab5-2b965ebe6664"/>
@@ -4241,24 +4327,25 @@
 </ct:contentTypeSchema>
 </file>
 
-<file path=customXml/item2.xml><?xml version="1.0" encoding="utf-8"?>
-<p:properties xmlns:p="http://schemas.microsoft.com/office/2006/metadata/properties" xmlns:xsi="http://www.w3.org/2001/XMLSchema-instance" xmlns:pc="http://schemas.microsoft.com/office/infopath/2007/PartnerControls">
-  <documentManagement>
-    <_activity xmlns="5e56eec9-9a2e-4f24-bab5-2b965ebe6664" xsi:nil="true"/>
-  </documentManagement>
-</p:properties>
+<file path=customXml/itemProps1.xml><?xml version="1.0" encoding="utf-8"?>
+<ds:datastoreItem xmlns:ds="http://schemas.openxmlformats.org/officeDocument/2006/customXml" ds:itemID="{0E488109-9E1A-4FBF-9A93-10445CB06AB4}">
+  <ds:schemaRefs>
+    <ds:schemaRef ds:uri="http://schemas.microsoft.com/sharepoint/v3/contenttype/forms"/>
+  </ds:schemaRefs>
+</ds:datastoreItem>
 </file>
 
-<file path=customXml/item3.xml><?xml version="1.0" encoding="utf-8"?>
-<?mso-contentType ?>
-<FormTemplates xmlns="http://schemas.microsoft.com/sharepoint/v3/contenttype/forms">
-  <Display>DocumentLibraryForm</Display>
-  <Edit>DocumentLibraryForm</Edit>
-  <New>DocumentLibraryForm</New>
-</FormTemplates>
+<file path=customXml/itemProps2.xml><?xml version="1.0" encoding="utf-8"?>
+<ds:datastoreItem xmlns:ds="http://schemas.openxmlformats.org/officeDocument/2006/customXml" ds:itemID="{980D0855-C1E6-4A62-AD93-A71267F33DB0}">
+  <ds:schemaRefs>
+    <ds:schemaRef ds:uri="http://schemas.microsoft.com/office/2006/metadata/properties"/>
+    <ds:schemaRef ds:uri="http://schemas.microsoft.com/office/infopath/2007/PartnerControls"/>
+    <ds:schemaRef ds:uri="5e56eec9-9a2e-4f24-bab5-2b965ebe6664"/>
+  </ds:schemaRefs>
+</ds:datastoreItem>
 </file>
 
-<file path=customXml/itemProps1.xml><?xml version="1.0" encoding="utf-8"?>
+<file path=customXml/itemProps3.xml><?xml version="1.0" encoding="utf-8"?>
 <ds:datastoreItem xmlns:ds="http://schemas.openxmlformats.org/officeDocument/2006/customXml" ds:itemID="{10533AE3-F489-45CE-8146-2D848168A97F}">
   <ds:schemaRefs>
     <ds:schemaRef ds:uri="http://schemas.microsoft.com/office/2006/metadata/contentType"/>
@@ -4275,22 +4362,4 @@
     <ds:schemaRef ds:uri="http://schemas.microsoft.com/internal/obd"/>
   </ds:schemaRefs>
 </ds:datastoreItem>
-</file>
-
-<file path=customXml/itemProps2.xml><?xml version="1.0" encoding="utf-8"?>
-<ds:datastoreItem xmlns:ds="http://schemas.openxmlformats.org/officeDocument/2006/customXml" ds:itemID="{980D0855-C1E6-4A62-AD93-A71267F33DB0}">
-  <ds:schemaRefs>
-    <ds:schemaRef ds:uri="http://schemas.microsoft.com/office/2006/metadata/properties"/>
-    <ds:schemaRef ds:uri="http://schemas.microsoft.com/office/infopath/2007/PartnerControls"/>
-    <ds:schemaRef ds:uri="5e56eec9-9a2e-4f24-bab5-2b965ebe6664"/>
-  </ds:schemaRefs>
-</ds:datastoreItem>
-</file>
-
-<file path=customXml/itemProps3.xml><?xml version="1.0" encoding="utf-8"?>
-<ds:datastoreItem xmlns:ds="http://schemas.openxmlformats.org/officeDocument/2006/customXml" ds:itemID="{0E488109-9E1A-4FBF-9A93-10445CB06AB4}">
-  <ds:schemaRefs>
-    <ds:schemaRef ds:uri="http://schemas.microsoft.com/sharepoint/v3/contenttype/forms"/>
-  </ds:schemaRefs>
-</ds:datastoreItem>
 </file>
</xml_diff>